<commit_message>
Alelos ">200", sexo desde el PDF y exportacion a PDF
- Lee repeticiones no exactas (">200", "<N") y las muestra tal cual;
  dos alelos ">200" no se informan como homocigosis.
- Toma el sexo del PDF ("Gender:") y, si no esta, lo deduce por la
  cantidad de alelos.
- pdf_exporter: una sola instancia de Word para todo el lote.
- Actualizacion del template.

Co-Authored-By: Claude Opus 5.5 <noreply@anthropic.com>
</commit_message>
<xml_diff>
--- a/templates/template_frax.docx
+++ b/templates/template_frax.docx
@@ -4277,7 +4277,7 @@
           <w:rFonts w:ascii="Cambria" w:eastAsia="Cambria" w:hAnsi="Cambria" w:cs="Cambria"/>
           <w:color w:val="000000"/>
         </w:rPr>
-        <w:t xml:space="preserve"> 55 re</w:t>
+        <w:t xml:space="preserve"> 54 re</w:t>
       </w:r>
       <w:r>
         <w:rPr>
@@ -4435,7 +4435,7 @@
           <w:rFonts w:ascii="Cambria" w:eastAsia="Cambria" w:hAnsi="Cambria" w:cs="Cambria"/>
           <w:color w:val="000000"/>
         </w:rPr>
-        <w:t xml:space="preserve"> 55)</w:t>
+        <w:t xml:space="preserve"> 54)</w:t>
       </w:r>
       <w:r>
         <w:rPr>

</xml_diff>